<commit_message>
Name the decoder-sensitive clips and correct remaining provenance wording
- Name VID048 and VID211 where the text refers to "the two clips named
  there"; the decoder comparison also differs in OS, Python and NumPy, so
  the difference is not attributed to the decoder alone.
- Removing the HSV mask from the released configuration changes no image
  decision; it is not true of every configuration, so say only that.
- The code does call the deep edge detector V3; drop "no detector was
  designated V3", and stop calling the flicker layer "V2 logic" in
  v1_heuristic.py (comments only).
- Algorithm 1 step 7 differences grayscale frames, as the code does.
- Alarm latency is 1.0 to 1.5 s, not approximately 1.5 s.
- One ERA conflict-class clip is labeled fire; state it.
- Fig. 6 panel (a) is the released weights, not "the reported result".
- requirements.txt: most, not every, result file carries a header.
- Rebuild makale_tez_uzun_versiyon.docx from its HTML.
</commit_message>
<xml_diff>
--- a/makale_tez_uzun_versiyon.docx
+++ b/makale_tez_uzun_versiyon.docx
@@ -102,7 +102,7 @@
         <w:t xml:space="preserve"> </w:t>
       </w:r>
       <w:r>
-        <w:t xml:space="preserve">Deep convolutional detectors can exceed the energy budget of lightweight unmanned aerial vehicles, motivating hand-set color rules that run on a central processing unit. This paper tests that justification. A fully specified detector intersecting hue-saturation-value, red-green-blue and luma-chroma spaces reaches, on the test split of a public wildfire dataset, a 52.65% F1-score against the 55.89% of a constant fire predictor and 43.41% accuracy against the 61.22% of a constant no-fire predictor. A saturation sweep moves recall by 32.70 points while precision stays within 2.25 points of the class prior, and the best threshold over the pipeline's own box count is the degenerate one, whereas a model fitted on a 512-bin color histogram of the same images reaches 82.28% F1 and 85.28% with texture and vertical-band histograms added; the cheaper of the two learned models timed against it costs 1.35 times the hand-set pipeline while scoring 77.33% against its 49.14%. The pipeline therefore destroys information its inputs contain, and neither its thresholds nor the compute budget explains this, and a resolution control removes 84.19% of spurious detections by bringing the images to a common size, at which the absolute area threshold and the fixed kernels act at a consistent scale. The detector itself is then replaced: a retrained MobileNetV3-Small reaches an average 93.83% true positive rate at a 0.32% false positive rate across five seeds on the 194 clips of an independent 483-clip real aerial corpus that contributed no training gradient. The released weights reach 92.65% on those clips, against 100.00% on the clips they were fitted on and 97.06% when the clip-level partition is ignored; that 4.41-point gap underscores the importance of proper dataset partitioning. Two further controls on the released weights bound the figure: every negative comes from only one of the two source corpora, and holding the source constant lowers the recall to 85.29%, while partitioning at the source event rather than the clip lowers it by about one point. The replacement clears null baselines the hand-set rule does not, and the curve implied by its alarm rule reaches an area of 0.995 on the held-out cohort. The five-seed figures and the curve were obtained under OpenCV 5.0.0, which changes two of the 483 released verdicts in the detector's favor; the released-weight figures are those of the less favorable OpenCV 4.13.0 build.</w:t>
+        <w:t xml:space="preserve">Deep convolutional detectors can exceed the energy budget of lightweight unmanned aerial vehicles, motivating hand-set color rules that run on a central processing unit. This paper tests that justification. A fully specified detector intersecting hue-saturation-value, red-green-blue and luma-chroma spaces reaches, on the test split of a public wildfire dataset, a 52.65% F1-score against the 55.89% of a constant fire predictor and 43.41% accuracy against the 61.22% of a constant no-fire predictor. A saturation sweep moves recall by 32.70 points while precision stays within 2.25 points of the class prior, and the best threshold over the pipeline's own box count is the degenerate one, whereas a model fitted on a 512-bin color histogram of the same images reaches 82.28% F1 and 85.28% with texture and vertical-band histograms added; the cheaper of the two learned models timed against it costs 1.35 times the hand-set pipeline while scoring 77.33% against its 49.14%. The pipeline therefore destroys information its inputs contain, and neither its thresholds nor the compute budget explains this. A resolution control removes 84.19% of spurious detections by bringing the images to a common size, at which the absolute area threshold and the fixed kernels act at a consistent scale. The detector itself is then replaced: a retrained MobileNetV3-Small reaches an average 93.83% true positive rate at a 0.32% false positive rate across five seeds on the 194 clips of an independent 483-clip real aerial corpus that contributed no training gradient. The released weights reach 92.65% on those clips, against 100.00% on the clips they were fitted on and 97.06% when the clip-level partition is ignored; that 4.41-point gap underscores the importance of proper dataset partitioning. Two further controls on the released weights bound the figure: every negative comes from only one of the two source corpora, and holding the source constant lowers the recall to 85.29%, while partitioning at the source event rather than the clip lowers it by about one point. The replacement clears null baselines the hand-set rule does not, and the curve implied by its alarm rule reaches an area of 0.995 on the held-out cohort. The five-seed figures and the curve were obtained under OpenCV 5.0.0, which changes two of the 483 released verdicts in the detector's favor; the released-weight figures are those of the less favorable OpenCV 4.13.0 build.</w:t>
       </w:r>
     </w:p>
     <w:p>
@@ -316,7 +316,7 @@
         <w:pStyle w:val="BodyText"/>
       </w:pPr>
       <w:r>
-        <w:t xml:space="preserve">The fundamental departure of the proposed architecture from contemporary deep learning methodologies lies in bypassing the hardware cost barrier for edge computing. Rather than relying on the GPU acceleration assumed by the CNN detectors of [16–18], this research executes a simultaneous logical intersection of the RGB, HSV, and YCbCr color spaces, augmented by a kinetic flickering layer that applies an explicit penalty to temporally static clusters. The intended effect of that penalty is to reduce stationary detections while retaining the lightweight processing footprint required for continuous UAV deployment. Section 4.5 replaces the stage outright and does not isolate the effect on the video available here, and Section 4.1 shows that the chromatic stage alone carries a false-positive rate above 80% on still images; we therefore present the formulation as a hypothesis that the evaluation tests rather than as an established improvement.</w:t>
+        <w:t xml:space="preserve">The fundamental departure of the proposed architecture from contemporary deep learning methodologies lies in bypassing the hardware cost barrier for edge computing. Rather than relying on the GPU acceleration assumed by the CNN detectors of [16–18], this research executes a simultaneous logical intersection of the RGB, HSV, and YCbCr color spaces, augmented by a kinetic flickering layer that applies an explicit penalty to temporally static clusters. The intended effect of that penalty is to reduce stationary detections while retaining the lightweight processing footprint required for continuous UAV deployment. Section 4.5 replaces the whole detector rather than isolating the effect of this penalty on video, and Section 4.1 shows that the chromatic stage alone carries a false-positive rate above 80% on still images; we therefore present the formulation as a hypothesis that the evaluation tests rather than as an established improvement.</w:t>
       </w:r>
     </w:p>
     <w:p>
@@ -1363,13 +1363,13 @@
         <w:tblLook w:firstRow="0"/>
       </w:tblPr>
       <w:tblGrid>
-        <w:gridCol w:w="1257"/>
-        <w:gridCol w:w="8381"/>
+        <w:gridCol w:w="1250"/>
+        <w:gridCol w:w="8388"/>
       </w:tblGrid>
       <w:tr>
         <w:tc>
           <w:tcPr>
-            <w:tcW w:w="1257" w:type="dxa"/>
+            <w:tcW w:w="1250" w:type="dxa"/>
           </w:tcPr>
           <w:p>
             <w:pPr>
@@ -1386,7 +1386,7 @@
         </w:tc>
         <w:tc>
           <w:tcPr>
-            <w:tcW w:w="8381" w:type="dxa"/>
+            <w:tcW w:w="8388" w:type="dxa"/>
           </w:tcPr>
           <w:p>
             <w:pPr>
@@ -1453,7 +1453,7 @@
       <w:tr>
         <w:tc>
           <w:tcPr>
-            <w:tcW w:w="1257" w:type="dxa"/>
+            <w:tcW w:w="1250" w:type="dxa"/>
           </w:tcPr>
           <w:p>
             <w:pPr>
@@ -1470,7 +1470,7 @@
         </w:tc>
         <w:tc>
           <w:tcPr>
-            <w:tcW w:w="8381" w:type="dxa"/>
+            <w:tcW w:w="8388" w:type="dxa"/>
           </w:tcPr>
           <w:p>
             <w:pPr>
@@ -1509,7 +1509,7 @@
       <w:tr>
         <w:tc>
           <w:tcPr>
-            <w:tcW w:w="1257" w:type="dxa"/>
+            <w:tcW w:w="1250" w:type="dxa"/>
           </w:tcPr>
           <w:p>
             <w:pPr>
@@ -1523,7 +1523,7 @@
         </w:tc>
         <w:tc>
           <w:tcPr>
-            <w:tcW w:w="8381" w:type="dxa"/>
+            <w:tcW w:w="8388" w:type="dxa"/>
           </w:tcPr>
           <w:p>
             <w:pPr>
@@ -1579,7 +1579,7 @@
       <w:tr>
         <w:tc>
           <w:tcPr>
-            <w:tcW w:w="1257" w:type="dxa"/>
+            <w:tcW w:w="1250" w:type="dxa"/>
           </w:tcPr>
           <w:p>
             <w:pPr>
@@ -1593,7 +1593,7 @@
         </w:tc>
         <w:tc>
           <w:tcPr>
-            <w:tcW w:w="8381" w:type="dxa"/>
+            <w:tcW w:w="8388" w:type="dxa"/>
           </w:tcPr>
           <w:p>
             <w:pPr>
@@ -1686,7 +1686,7 @@
       <w:tr>
         <w:tc>
           <w:tcPr>
-            <w:tcW w:w="1257" w:type="dxa"/>
+            <w:tcW w:w="1250" w:type="dxa"/>
           </w:tcPr>
           <w:p>
             <w:pPr>
@@ -1700,7 +1700,7 @@
         </w:tc>
         <w:tc>
           <w:tcPr>
-            <w:tcW w:w="8381" w:type="dxa"/>
+            <w:tcW w:w="8388" w:type="dxa"/>
           </w:tcPr>
           <w:p>
             <w:pPr>
@@ -1799,7 +1799,7 @@
       <w:tr>
         <w:tc>
           <w:tcPr>
-            <w:tcW w:w="1257" w:type="dxa"/>
+            <w:tcW w:w="1250" w:type="dxa"/>
           </w:tcPr>
           <w:p>
             <w:pPr>
@@ -1813,7 +1813,7 @@
         </w:tc>
         <w:tc>
           <w:tcPr>
-            <w:tcW w:w="8381" w:type="dxa"/>
+            <w:tcW w:w="8388" w:type="dxa"/>
           </w:tcPr>
           <w:p>
             <w:pPr>
@@ -1894,7 +1894,7 @@
       <w:tr>
         <w:tc>
           <w:tcPr>
-            <w:tcW w:w="1257" w:type="dxa"/>
+            <w:tcW w:w="1250" w:type="dxa"/>
           </w:tcPr>
           <w:p>
             <w:pPr>
@@ -1908,7 +1908,7 @@
         </w:tc>
         <w:tc>
           <w:tcPr>
-            <w:tcW w:w="8381" w:type="dxa"/>
+            <w:tcW w:w="8388" w:type="dxa"/>
           </w:tcPr>
           <w:p>
             <w:pPr>
@@ -2078,7 +2078,7 @@
       <w:tr>
         <w:tc>
           <w:tcPr>
-            <w:tcW w:w="1257" w:type="dxa"/>
+            <w:tcW w:w="1250" w:type="dxa"/>
           </w:tcPr>
           <w:p>
             <w:pPr>
@@ -2092,7 +2092,7 @@
         </w:tc>
         <w:tc>
           <w:tcPr>
-            <w:tcW w:w="8381" w:type="dxa"/>
+            <w:tcW w:w="8388" w:type="dxa"/>
           </w:tcPr>
           <w:p>
             <w:pPr>
@@ -2277,7 +2277,7 @@
       <w:tr>
         <w:tc>
           <w:tcPr>
-            <w:tcW w:w="1257" w:type="dxa"/>
+            <w:tcW w:w="1250" w:type="dxa"/>
           </w:tcPr>
           <w:p>
             <w:pPr>
@@ -2291,7 +2291,7 @@
         </w:tc>
         <w:tc>
           <w:tcPr>
-            <w:tcW w:w="8381" w:type="dxa"/>
+            <w:tcW w:w="8388" w:type="dxa"/>
           </w:tcPr>
           <w:p>
             <w:pPr>
@@ -2535,13 +2535,19 @@
                 <m:t>∅</m:t>
               </m:r>
             </m:oMath>
+            <w:r>
+              <w:t xml:space="preserve"> </w:t>
+            </w:r>
+            <w:r>
+              <w:t xml:space="preserve"> (on grayscale frames)</w:t>
+            </w:r>
           </w:p>
         </w:tc>
       </w:tr>
       <w:tr>
         <w:tc>
           <w:tcPr>
-            <w:tcW w:w="1257" w:type="dxa"/>
+            <w:tcW w:w="1250" w:type="dxa"/>
           </w:tcPr>
           <w:p>
             <w:pPr>
@@ -2555,7 +2561,7 @@
         </w:tc>
         <w:tc>
           <w:tcPr>
-            <w:tcW w:w="8381" w:type="dxa"/>
+            <w:tcW w:w="8388" w:type="dxa"/>
           </w:tcPr>
           <w:p>
             <w:pPr>
@@ -2664,7 +2670,7 @@
       <w:tr>
         <w:tc>
           <w:tcPr>
-            <w:tcW w:w="1257" w:type="dxa"/>
+            <w:tcW w:w="1250" w:type="dxa"/>
           </w:tcPr>
           <w:p>
             <w:pPr>
@@ -2678,7 +2684,7 @@
         </w:tc>
         <w:tc>
           <w:tcPr>
-            <w:tcW w:w="8381" w:type="dxa"/>
+            <w:tcW w:w="8388" w:type="dxa"/>
           </w:tcPr>
           <w:p>
             <w:pPr>
@@ -2900,7 +2906,7 @@
       <w:tr>
         <w:tc>
           <w:tcPr>
-            <w:tcW w:w="1257" w:type="dxa"/>
+            <w:tcW w:w="1250" w:type="dxa"/>
           </w:tcPr>
           <w:p>
             <w:pPr>
@@ -2914,7 +2920,7 @@
         </w:tc>
         <w:tc>
           <w:tcPr>
-            <w:tcW w:w="8381" w:type="dxa"/>
+            <w:tcW w:w="8388" w:type="dxa"/>
           </w:tcPr>
           <w:p>
             <w:pPr>
@@ -3009,7 +3015,7 @@
       <w:tr>
         <w:tc>
           <w:tcPr>
-            <w:tcW w:w="1257" w:type="dxa"/>
+            <w:tcW w:w="1250" w:type="dxa"/>
           </w:tcPr>
           <w:p>
             <w:pPr>
@@ -3023,7 +3029,7 @@
         </w:tc>
         <w:tc>
           <w:tcPr>
-            <w:tcW w:w="8381" w:type="dxa"/>
+            <w:tcW w:w="8388" w:type="dxa"/>
           </w:tcPr>
           <w:p>
             <w:pPr>
@@ -3045,7 +3051,7 @@
       <w:tr>
         <w:tc>
           <w:tcPr>
-            <w:tcW w:w="1257" w:type="dxa"/>
+            <w:tcW w:w="1250" w:type="dxa"/>
           </w:tcPr>
           <w:p>
             <w:pPr>
@@ -3059,7 +3065,7 @@
         </w:tc>
         <w:tc>
           <w:tcPr>
-            <w:tcW w:w="8381" w:type="dxa"/>
+            <w:tcW w:w="8388" w:type="dxa"/>
           </w:tcPr>
           <w:p>
             <w:pPr>
@@ -10143,7 +10149,7 @@
         <w:pStyle w:val="FirstParagraph"/>
       </w:pPr>
       <w:r>
-        <w:t xml:space="preserve">This section replaces the detector itself. On naming, the configuration indices denote project generations — V1 the hand-set pipeline of Section 3, V2 the learned feature baselines of Section 4.4. No detector was designated V3; the "V3" in this section's released filenames (</w:t>
+        <w:t xml:space="preserve">This section replaces the detector itself. On naming, the configuration indices denote project generations — V1 the hand-set pipeline of Section 3, V2 the learned feature baselines of Section 4.4. The released code and filenames (</w:t>
       </w:r>
       <w:r>
         <w:rPr>
@@ -10152,7 +10158,7 @@
         <w:t xml:space="preserve">v3_mobilenet.pth</w:t>
       </w:r>
       <w:r>
-        <w:t xml:space="preserve">) is the MobileNetV3 backbone version [34], so we call this configuration the deep edge detector throughout.</w:t>
+        <w:t xml:space="preserve">) label this detector V3, after the MobileNetV3 backbone it uses [34]; to keep it distinct from the project generations V1 and V2 we call this configuration the deep edge detector throughout.</w:t>
       </w:r>
     </w:p>
     <w:p>
@@ -11227,7 +11233,7 @@
         <w:pStyle w:val="BodyText"/>
       </w:pPr>
       <w:r>
-        <w:t xml:space="preserve">A second source of variation appeared when the evaluator was re-run on a different machine, and it is recorded here for completeness. Under OpenCV 5.0 on Windows the evaluator reproduces all but 2 of the 483 verdicts recorded under OpenCV 4.13 on Linux. Both differences happen to favor the detector, moving the recall of the released weights on the held-out cohort from 92.65% to 94.12% and the false-positive rate from 0.79% to 0.00%. For the released weights we report the lower pair, corresponding to the released artifacts, to keep that evaluation conservative; the five-seed sweep and the operating curve were run under OpenCV 5.0.0, the build that yields the higher pair for these weights. The effect is small at 0.41% of the corpus, but it is not negligible at this cohort size, where a single clip is worth 1.47 points of recall. A third pass, by the PyTorch reference evaluator</w:t>
+        <w:t xml:space="preserve">A second source of variation appeared when the evaluator was re-run on a different machine, and it is recorded here for completeness. Under OpenCV 5.0 on Windows the evaluator reproduces all but 2 of the 483 verdicts recorded under OpenCV 4.13 on Linux, those of VID048, a fire clip, and VID211, a no-fire clip, both in the untouched part of the held-out set. Both differences happen to favor the detector, moving the recall of the released weights on the held-out cohort from 92.65% to 94.12% and the false-positive rate from 0.79% to 0.00%. For the released weights we report the lower pair, corresponding to the released artifacts, to keep that evaluation conservative; the five-seed sweep and the operating curve were run under OpenCV 5.0.0, the build that yields the higher pair for these weights. The effect is small at 0.41% of the corpus, but it is not negligible at this cohort size, where a single clip is worth 1.47 points of recall. A third pass, by the PyTorch reference evaluator</w:t>
       </w:r>
       <w:r>
         <w:t xml:space="preserve"> </w:t>
@@ -11459,7 +11465,7 @@
         <w:pStyle w:val="BodyText"/>
       </w:pPr>
       <w:r>
-        <w:t xml:space="preserve">Fig. 7 gives the result on the 194 clips that contributed no training gradient. The area under the receiver operating characteristic is 0.995 and the average precision is 0.9923 against a class prior of 35.05%. The curve therefore says something the single operating point cannot: the ordering the network induces over clips is nearly separable, and the deployed rule is not sitting at a lucky point on a poor ranking. It was computed under the OpenCV 5.0 build discussed two paragraphs above, so the point it passes through is that build's 94.12% recall at a 0.00% false-positive rate rather than the pair reported above; the two differ by exactly the two clips named there and by nothing else.</w:t>
+        <w:t xml:space="preserve">Fig. 7 gives the result on the 194 clips that contributed no training gradient. The area under the receiver operating characteristic is 0.995 and the average precision is 0.9923 against a class prior of 35.05%. The curve therefore says something the single operating point cannot: the ordering the network induces over clips is nearly separable, and the deployed rule is not sitting at a lucky point on a poor ranking. It was computed under the OpenCV 5.0 build discussed two paragraphs above, so the point it passes through is that build's 94.12% recall at a 0.00% false-positive rate rather than the pair reported above; the two differ by exactly the two clips named there, VID048 and VID211, and by nothing else.</w:t>
       </w:r>
     </w:p>
     <w:p>
@@ -11467,7 +11473,7 @@
         <w:pStyle w:val="BodyText"/>
       </w:pPr>
       <w:r>
-        <w:t xml:space="preserve">Two properties of the corpus give a classifier a route to the right answer that has nothing to do with fire, and neither is neutralised by the clip-level partition. Both are measured here rather than left for a reader to suspect. The first is the source. Every negative clip is an ERA event, whereas the positives are split 86 to 84 between the Boreal wildfire corpus and ERA, so a network that learned to recognize the Boreal source rather than fire would score perfectly on the Boreal positives and still post a high recall. It very nearly does: on the held-out clips the Boreal positives are detected at 100.0% against 85.29% for the ERA positives. Restricting the held-out set to ERA alone holds the source constant, and there the detector reaches a recall of 85.29% at a false-positive rate of 0.79% on 160 clips, for an F1-score of 90.62%. The result therefore survives the removal of the source cue, but 7.36 points of the released weights' held-out recall of 92.65% are attributable to a cohort the model never sees as a negative, and the honest figure for a deployment facing one sensor is the ERA-only one.</w:t>
+        <w:t xml:space="preserve">Two properties of the corpus give a classifier a route to the right answer that has nothing to do with fire, and neither is neutralised by the clip-level partition. Both are measured here rather than left for a reader to suspect. The first is the source. Every negative clip is an ERA event, whereas the positives are split 86 to 84 between the Boreal wildfire corpus and ERA, the ERA positives being 83 clips of its fire event class and one clip of its conflict class that is labeled fire, so a network that learned to recognize the Boreal source rather than fire would score perfectly on the Boreal positives and still post a high recall. It very nearly does: on the held-out clips the Boreal positives are detected at 100.0% against 85.29% for the ERA positives. Restricting the held-out set to ERA alone holds the source constant, and there the detector reaches a recall of 85.29% at a false-positive rate of 0.79% on 160 clips, for an F1-score of 90.62%. The result therefore survives the removal of the source cue, but 7.36 points of the released weights' held-out recall of 92.65% are attributable to a cohort the model never sees as a negative, and the honest figure for a deployment facing one sensor is the ERA-only one.</w:t>
       </w:r>
     </w:p>
     <w:p>
@@ -12402,7 +12408,7 @@
         <w:t xml:space="preserve"> </w:t>
       </w:r>
       <w:r>
-        <w:t xml:space="preserve">under a 300-timed-call, warm-up-discarded protocol like that of Section 4.4, but on one synthetic 640 × 480 frame and on a single thread. Preprocessing and the forward pass together cost a mean of 13.26 ms per frame over 300 timed calls, of which the forward pass alone accounts for 10.89 ms, on an Intel64 family 6 model 142 stepping 12 CPU. The frame rate this implies is stated rather than asserted: 75.4 FPS sustained at the pipeline figure. The detector samples at two frames per second, so the alarm latency that matters operationally is the time to three consecutive positive samples, approximately 1.5 s after ignition becomes visible, and this is bounded by the sampling policy rather than by the per-frame cost of the classifier. Two properties of that sampling policy should be stated precisely, because they govern how many decisions each clip actually contributes. The stride is computed as the integer part of the container frame rate divided by two, so the nominal two samples per second is exact only when the frame rate is an even integer; at the 24 frames per second of most clips in this corpus the detector sees every twelfth frame, and when a container reports no frame rate at all the evaluator falls back to 24. The scan also stops at the first alarm rather than running to the end of the clip, since the verdict cannot change afterwards, which is why the number of inferences recorded per clip varies and is not a fixed function of clip length.</w:t>
+        <w:t xml:space="preserve">under a 300-timed-call, warm-up-discarded protocol like that of Section 4.4, but on one synthetic 640 × 480 frame and on a single thread. Preprocessing and the forward pass together cost a mean of 13.26 ms per frame over 300 timed calls, of which the forward pass alone accounts for 10.89 ms, on an Intel64 family 6 model 142 stepping 12 CPU. The frame rate this implies is stated rather than asserted: 75.4 FPS sustained at the pipeline figure. The detector samples at two frames per second, so the alarm latency that matters operationally is the time to three consecutive positive samples, between about 1.0 s and 1.5 s after ignition becomes visible, depending on where the first positive sample falls, and this is bounded by the sampling policy rather than by the per-frame cost of the classifier. Two properties of that sampling policy should be stated precisely, because they govern how many decisions each clip actually contributes. The stride is computed as the integer part of the container frame rate divided by two, so the nominal two samples per second is exact only when the frame rate is an even integer; at the 24 frames per second of most clips in this corpus the detector sees every twelfth frame, and when a container reports no frame rate at all the evaluator falls back to 24. The scan also stops at the first alarm rather than running to the end of the clip, since the verdict cannot change afterwards, which is why the number of inferences recorded per clip varies and is not a fixed function of clip length.</w:t>
       </w:r>
     </w:p>
     <w:p>
@@ -12585,7 +12591,7 @@
         <w:t xml:space="preserve">Second</w:t>
       </w:r>
       <w:r>
-        <w:t xml:space="preserve">, the HSV mask never alters an image-level decision, so at the level of image decisions the advertised triple intersection is the RGB ∩ YCbCr pair, and F1 improves as the filter becomes less discriminative — the signature of features carrying little class information.</w:t>
+        <w:t xml:space="preserve">, removing the HSV mask from the released configuration alters no image-level decision, so at the level of image decisions the advertised triple intersection is the RGB ∩ YCbCr pair, and F1 improves as the filter becomes less discriminative — the signature of features carrying little class information.</w:t>
       </w:r>
       <w:r>
         <w:t xml:space="preserve"> </w:t>
@@ -12609,7 +12615,7 @@
         <w:t xml:space="preserve">Fourth</w:t>
       </w:r>
       <w:r>
-        <w:t xml:space="preserve">, scoring the released deep edge weights on unseen rather than fitted clips costs 7.35 points of recall, and a whole-corpus evaluation would have absorbed most of that silently. Its operating curve, swept over the threshold the alarm rule implies rather than a surrogate, reaches an area of 0.995 on that unseen cohort, and re-running the released evaluator under a different video decoder changes two verdicts in 483, which we report and do not adopt for the released-weight figures.</w:t>
+        <w:t xml:space="preserve">, scoring the released deep edge weights on unseen rather than fitted clips costs 7.35 points of recall, and a whole-corpus evaluation would have absorbed most of that silently. Its operating curve, swept over the threshold the alarm rule implies rather than a surrogate, reaches an area of 0.995 on that unseen cohort, and re-running the released evaluator under a different video decoder and software environment changes two verdicts in 483, which we report and do not adopt for the released-weight figures.</w:t>
       </w:r>
     </w:p>
     <w:p>
@@ -12625,7 +12631,7 @@
         <w:pStyle w:val="BodyText"/>
       </w:pPr>
       <w:r>
-        <w:t xml:space="preserve">The limitations constrain every statement above. The image datasets carry no bounding-box annotations, so all image results are image-level classification and no IoU or mAP was computed. Section 4.5 crosses to real footage, but on a corpus the authors did not collect. No measurement covers live capture, display, operating-system queues or radio transmission. The learned comparison of Section 4.4 is a classifier and not a detector; its ten-seed sweep bounds the variance of the fit but not of the selection procedure, and its random-forest figures are specific to scikit-learn 1.9.0. The clip-level verdicts are specific to a video decoder as well as to a seed: two of the 483 clips decode differently under OpenCV 5.0 than under the 4.13 that produced the released artifacts. One is a fire clip and moves the recall on the reported cohort by 1.47 points, the other a no-fire clip and moves the false-positive rate by 0.79; both move in the detector's favor; the released-weights figures quoted throughout are the lower pair, whereas the five-seed sweep and Fig. 7 were run under OpenCV 5.0.0. Any clip-level result in this literature that does not name its decoder carries the same uncertainty unmeasured.</w:t>
+        <w:t xml:space="preserve">The limitations constrain every statement above. The image datasets carry no bounding-box annotations, so all image results are image-level classification and no IoU or mAP was computed. Section 4.5 crosses to real footage, but on a corpus the authors did not collect. No measurement covers live capture, display, operating-system queues or radio transmission. The learned comparison of Section 4.4 is a classifier and not a detector; its ten-seed sweep bounds the variance of the fit but not of the selection procedure, and its random-forest figures are specific to scikit-learn 1.9.0. The clip-level verdicts are specific to the decoding environment as well as to a seed: two of the 483 clips receive different verdicts under OpenCV 5.0 on Windows than under the OpenCV 4.13 on Linux that produced the released artifacts, and the two runs also differ in Python and NumPy versions, so the difference is not attributed to the decoder alone. One is a fire clip and moves the recall on the reported cohort by 1.47 points, the other a no-fire clip and moves the false-positive rate by 0.79; both move in the detector's favor; the released-weights figures quoted throughout are the lower pair, whereas the five-seed sweep and Fig. 7 were run under OpenCV 5.0.0. Any clip-level result in this literature that does not name its decoder carries the same uncertainty unmeasured.</w:t>
       </w:r>
     </w:p>
     <w:p>

</xml_diff>

<commit_message>
Explain the PyTorch verdict file and stop the reference evaluator overwriting results
- _clip_verdicts_torch.json and _loop_latency_ms.json were written three
  minutes before v3_mobilenet.pth (original file timestamps), so they score an
  earlier fit; the manuscript now says so instead of presenting the five-clip
  difference as an unexplained evaluator discrepancy.
- evaluate_v3_videos.py wrote v3_results_by_split.json, the NumPy-path result
  the paper reports; it now writes v3_results_by_split_torch.json.
- README: verify_numpy_model.py checks the training frames, not every frame.
- Descriptive fields only, no numbers changed: the saturation sweep no longer
  flags S = 60 as the released configuration (it differs in the halo floor),
  and the image-level artifact's white-hot convention text now matches the
  follows_rgb convention its numbers were produced under (the text the
  current script writes).
</commit_message>
<xml_diff>
--- a/makale_tez_uzun_versiyon.docx
+++ b/makale_tez_uzun_versiyon.docx
@@ -11233,7 +11233,19 @@
         <w:pStyle w:val="BodyText"/>
       </w:pPr>
       <w:r>
-        <w:t xml:space="preserve">A second source of variation appeared when the evaluator was re-run on a different machine, and it is recorded here for completeness. Under OpenCV 5.0 on Windows the evaluator reproduces all but 2 of the 483 verdicts recorded under OpenCV 4.13 on Linux, those of VID048, a fire clip, and VID211, a no-fire clip, both in the untouched part of the held-out set. Both differences happen to favor the detector, moving the recall of the released weights on the held-out cohort from 92.65% to 94.12% and the false-positive rate from 0.79% to 0.00%. For the released weights we report the lower pair, corresponding to the released artifacts, to keep that evaluation conservative; the five-seed sweep and the operating curve were run under OpenCV 5.0.0, the build that yields the higher pair for these weights. The effect is small at 0.41% of the corpus, but it is not negligible at this cohort size, where a single clip is worth 1.47 points of recall. A third pass, by the PyTorch reference evaluator</w:t>
+        <w:t xml:space="preserve">A second source of variation appeared when the evaluator was re-run on a different machine, and it is recorded here for completeness. Under OpenCV 5.0 on Windows the evaluator reproduces all but 2 of the 483 verdicts recorded under OpenCV 4.13 on Linux, those of VID048, a fire clip, and VID211, a no-fire clip, both in the untouched part of the held-out set. Both differences happen to favor the detector, moving the recall of the released weights on the held-out cohort from 92.65% to 94.12% and the false-positive rate from 0.79% to 0.00%. For the released weights we report the lower pair, corresponding to the released artifacts, to keep that evaluation conservative; the five-seed sweep and the operating curve were run under OpenCV 5.0.0, the build that yields the higher pair for these weights. The effect is small at 0.41% of the corpus, but it is not negligible at this cohort size, where a single clip is worth 1.47 points of recall. The release also contains</w:t>
+      </w:r>
+      <w:r>
+        <w:t xml:space="preserve"> </w:t>
+      </w:r>
+      <w:r>
+        <w:rPr>
+          <w:rStyle w:val="VerbatimChar"/>
+        </w:rPr>
+        <w:t xml:space="preserve">_clip_verdicts_torch.json</w:t>
+      </w:r>
+      <w:r>
+        <w:t xml:space="preserve">, a pass of the PyTorch reference evaluator</w:t>
       </w:r>
       <w:r>
         <w:t xml:space="preserve"> </w:t>
@@ -11245,34 +11257,10 @@
         <w:t xml:space="preserve">evaluate_v3_videos.py</w:t>
       </w:r>
       <w:r>
-        <w:t xml:space="preserve">, differs from the released verdicts on five clips, two fire and three no-fire, and gives 95.59% recall at a 3.17% false-positive rate on the held-out cohort; its verdicts are released as</w:t>
-      </w:r>
-      <w:r>
         <w:t xml:space="preserve"> </w:t>
       </w:r>
       <w:r>
-        <w:rPr>
-          <w:rStyle w:val="VerbatimChar"/>
-        </w:rPr>
-        <w:t xml:space="preserve">_clip_verdicts_torch.json</w:t>
-      </w:r>
-      <w:r>
-        <w:t xml:space="preserve">, and the reported verdicts remain those of the NumPy path. The source of this difference has not been isolated: the check of the NumPy network against torchvision by</w:t>
-      </w:r>
-      <w:r>
-        <w:t xml:space="preserve"> </w:t>
-      </w:r>
-      <w:r>
-        <w:rPr>
-          <w:rStyle w:val="VerbatimChar"/>
-        </w:rPr>
-        <w:t xml:space="preserve">tools/verify_numpy_model.py</w:t>
-      </w:r>
-      <w:r>
-        <w:t xml:space="preserve"> </w:t>
-      </w:r>
-      <w:r>
-        <w:t xml:space="preserve">covers the 224 × 224 training frames but not the native-resolution resize used at evaluation.</w:t>
+        <w:t xml:space="preserve">that differs from the released verdicts on five clips, two fire and three no-fire. According to the timestamps of the original files on the machine that produced them, it was written three minutes before the released weights file, so it scored an earlier fit rather than the released weights, and it is not a comparison of the two evaluators, which implement the same sampling, resizing and decision rule; a PyTorch pass over the released weights has not been recorded.</w:t>
       </w:r>
     </w:p>
     <w:p>
@@ -12416,7 +12404,7 @@
         <w:pStyle w:val="BodyText"/>
       </w:pPr>
       <w:r>
-        <w:t xml:space="preserve">The per-frame cost quoted above carries its protocol with it, and a second timing record exists which is reported here rather than dropped. The 13.26 ms is the mean of 300 timed calls following 30 discarded warm-up calls, on a single thread, over a 640 × 480 frame resized to the network input; it covers preprocessing and the forward pass and excludes video decoding, so it is a cost of the network and not of a pipeline. The PyTorch reference evaluator independently instruments its own forward calls, and over the 4342 inferences of its full corpus pass it records a mean of 21.82 ms and a median of 18.85 ms. Two things separate that record from the figure above, and both must be stated before the two are set side by side: it times the forward pass alone, so the comparable controlled figure is the 10.89 ms rather than the 13.26 ms, and it is neither warm-up corrected nor taken on a quiescent host, the same process being engaged in decoding video throughout. The two are therefore not competing estimates of one quantity: the smaller is what the network costs under a controlled protocol, and the larger is what the same forward pass costs while sharing a CPU with a decoder. Both are reported because the second is the one a deployment would experience, and because a reader who finds the artifact should not be left to wonder why it disagrees with the text.</w:t>
+        <w:t xml:space="preserve">The per-frame cost quoted above carries its protocol with it, and a second timing record exists which is reported here rather than dropped. The 13.26 ms is the mean of 300 timed calls following 30 discarded warm-up calls, on a single thread, over a 640 × 480 frame resized to the network input; it covers preprocessing and the forward pass and excludes video decoding, so it is a cost of the network and not of a pipeline. The PyTorch reference evaluator independently instruments its own forward calls, and over the 4342 inferences of its recorded corpus pass, the earlier pass described in Section 4.2, which used a network of the same architecture and input size, it records a mean of 21.82 ms and a median of 18.85 ms. Two things separate that record from the figure above, and both must be stated before the two are set side by side: it times the forward pass alone, so the comparable controlled figure is the 10.89 ms rather than the 13.26 ms, and it is neither warm-up corrected nor taken on a quiescent host, the same process being engaged in decoding video throughout. The two are therefore not competing estimates of one quantity: the smaller is what the network costs under a controlled protocol, and the larger is what the same forward pass costs while sharing a CPU with a decoder. Both are reported because the second is the one a deployment would experience, and because a reader who finds the artifact should not be left to wonder why it disagrees with the text.</w:t>
       </w:r>
     </w:p>
     <w:p>

</xml_diff>